<commit_message>
feat: add daily plan with due reviews, ten new senses and streak
今日任务（#23）：按用户时区的当天汇总待复习、每日 10 个新词义与连续学习天数，
全部由作答事实与学习状态计算，不新增业务表。

- GET /api/v1/me/today 与 /today 页面；按钮直接创建练习并进入练习页
- POST /api/v1/practice/sessions 新增 focus=new_senses：只出任何题型都未作答的词义
- 导航“今日”，概览页主按钮改为今日任务，练习小结可返回今日任务
- GLOSSARY 新增今日任务、今日新词义、连续学习天数；需求、接口、验收（T15）与日程同步
- evidence/exp02/today-http.*；截图重新生成并加入实验二报告图 5；演示脚本第 4、5 步
- handoff_check.sh 增加今日任务检查

验收：T15

Co-Authored-By: Claude Opus 5.5 <noreply@anthropic.com>
</commit_message>
<xml_diff>
--- a/docs/reports/实验二_Web页面设计.docx
+++ b/docs/reports/实验二_Web页面设计.docx
@@ -6848,7 +6848,7 @@
                 <w:sz w:val="24"/>
                 <w:szCs w:val="24"/>
               </w:rPr>
-              <w:t xml:space="preserve">功能扩展：在登录的基础上，系统实现了注册、退出和完整的背单词学习闭环——选择目标词表、三类题型练习（服务端判分，作答与学习状态在同一事务中提交）、复习计划与统计。下表摘自答辩路径实测（evidence/exp02/review-path.txt）：</w:t>
+              <w:t xml:space="preserve">功能扩展：在登录的基础上，系统实现了注册、退出和完整的背单词学习闭环——选择目标词表、三类题型练习（服务端判分，作答与学习状态在同一事务中提交）、复习计划与统计，以及汇总当天待复习、每日 10 个新词义与连续学习天数的今日任务。下表摘自答辩路径与今日任务实测（evidence/exp02/review-path.txt、today-http.txt）：</w:t>
             </w:r>
           </w:p>
           <w:tbl>
@@ -7170,6 +7170,56 @@
                       <w:szCs w:val="18"/>
                     </w:rPr>
                     <w:t xml:space="preserve">学习状态与作答记录一致：核对 8 组（用户, 词义, 题型）。</w:t>
+                  </w:r>
+                </w:p>
+              </w:tc>
+            </w:tr>
+            <w:tr>
+              <w:tc>
+                <w:tcPr>
+                  <w:tcW w:w="3950" w:type="dxa"/>
+                </w:tcPr>
+                <w:p>
+                  <w:pPr>
+                    <w:spacing w:before="20" w:after="20" w:line="260" w:lineRule="auto"/>
+                    <w:jc w:val="start"/>
+                    <w:rPr>
+                      <w:sz w:val="18"/>
+                    </w:rPr>
+                  </w:pPr>
+                  <w:r>
+                    <w:rPr>
+                      <w:rFonts w:ascii="宋体" w:hAnsi="宋体" w:eastAsia="宋体" w:cs="宋体"/>
+                      <w:b w:val="0"/>
+                      <w:bCs w:val="0"/>
+                      <w:sz w:val="18"/>
+                      <w:szCs w:val="18"/>
+                    </w:rPr>
+                    <w:t xml:space="preserve">今日任务（新账户）</w:t>
+                  </w:r>
+                </w:p>
+              </w:tc>
+              <w:tc>
+                <w:tcPr>
+                  <w:tcW w:w="3950" w:type="dxa"/>
+                </w:tcPr>
+                <w:p>
+                  <w:pPr>
+                    <w:spacing w:before="20" w:after="20" w:line="260" w:lineRule="auto"/>
+                    <w:jc w:val="start"/>
+                    <w:rPr>
+                      <w:sz w:val="18"/>
+                    </w:rPr>
+                  </w:pPr>
+                  <w:r>
+                    <w:rPr>
+                      <w:rFonts w:ascii="宋体" w:hAnsi="宋体" w:eastAsia="宋体" w:cs="宋体"/>
+                      <w:b w:val="0"/>
+                      <w:bCs w:val="0"/>
+                      <w:sz w:val="18"/>
+                      <w:szCs w:val="18"/>
+                    </w:rPr>
+                    <w:t xml:space="preserve">新词义 0/10；完成 10 个新词义（2 题答错）后显示已完成，连续学习 1 天；再学新词时与已作答词义重叠 0 题</w:t>
                   </w:r>
                 </w:p>
               </w:tc>
@@ -7282,7 +7332,7 @@
             <w:r>
               <w:drawing>
                 <wp:inline distT="0" distB="0" distL="0" distR="0">
-                  <wp:extent cx="5016500" cy="3527226"/>
+                  <wp:extent cx="5016500" cy="4130774"/>
                   <wp:docPr id="5004" name="e2_review.png"/>
                   <wp:cNvGraphicFramePr>
                     <a:graphicFrameLocks xmlns:a="http://schemas.openxmlformats.org/drawingml/2006/main" noChangeAspect="1"/>
@@ -7303,7 +7353,7 @@
                         <pic:spPr>
                           <a:xfrm>
                             <a:off x="0" y="0"/>
-                            <a:ext cx="5016500" cy="3527226"/>
+                            <a:ext cx="5016500" cy="4130774"/>
                           </a:xfrm>
                           <a:prstGeom prst="rect">
                             <a:avLst/>
@@ -7342,6 +7392,84 @@
                 <w:szCs w:val="21"/>
               </w:rPr>
               <w:t xml:space="preserve">图 4  复习计划：已到期与未到期错题</w:t>
+            </w:r>
+          </w:p>
+          <w:p>
+            <w:pPr>
+              <w:pStyle w:val="Normal"/>
+              <w:widowControl/>
+              <w:keepNext/>
+              <w:spacing w:before="0" w:after="0" w:lineRule="auto" w:line="240"/>
+              <w:jc w:val="center"/>
+              <w:rPr>
+                <w:b w:val="0"/>
+                <w:sz w:val="24"/>
+                <w:szCs w:val="24"/>
+              </w:rPr>
+            </w:pPr>
+            <w:r>
+              <w:drawing>
+                <wp:inline distT="0" distB="0" distL="0" distR="0">
+                  <wp:extent cx="5016500" cy="3546822"/>
+                  <wp:docPr id="5005" name="e2_today.png"/>
+                  <wp:cNvGraphicFramePr>
+                    <a:graphicFrameLocks xmlns:a="http://schemas.openxmlformats.org/drawingml/2006/main" noChangeAspect="1"/>
+                  </wp:cNvGraphicFramePr>
+                  <a:graphic xmlns:a="http://schemas.openxmlformats.org/drawingml/2006/main">
+                    <a:graphicData uri="http://schemas.openxmlformats.org/drawingml/2006/picture">
+                      <pic:pic xmlns:pic="http://schemas.openxmlformats.org/drawingml/2006/picture">
+                        <pic:nvPicPr>
+                          <pic:cNvPr id="5005" name="e2_today.png"/>
+                          <pic:cNvPicPr/>
+                        </pic:nvPicPr>
+                        <pic:blipFill>
+                          <a:blip r:embed="rId11"/>
+                          <a:stretch>
+                            <a:fillRect/>
+                          </a:stretch>
+                        </pic:blipFill>
+                        <pic:spPr>
+                          <a:xfrm>
+                            <a:off x="0" y="0"/>
+                            <a:ext cx="5016500" cy="3546822"/>
+                          </a:xfrm>
+                          <a:prstGeom prst="rect">
+                            <a:avLst/>
+                          </a:prstGeom>
+                          <a:ln w="6350">
+                            <a:solidFill>
+                              <a:srgbClr val="BBBBBB"/>
+                            </a:solidFill>
+                          </a:ln>
+                        </pic:spPr>
+                      </pic:pic>
+                    </a:graphicData>
+                  </a:graphic>
+                </wp:inline>
+              </w:drawing>
+            </w:r>
+          </w:p>
+          <w:p>
+            <w:pPr>
+              <w:pStyle w:val="Normal"/>
+              <w:widowControl/>
+              <w:spacing w:before="0" w:after="120" w:lineRule="auto" w:line="300"/>
+              <w:jc w:val="center"/>
+              <w:rPr>
+                <w:b w:val="0"/>
+                <w:sz w:val="21"/>
+                <w:szCs w:val="21"/>
+              </w:rPr>
+            </w:pPr>
+            <w:r>
+              <w:rPr>
+                <w:rFonts w:ascii="宋体" w:hAnsi="宋体" w:eastAsia="宋体" w:cs="宋体"/>
+                <w:b w:val="0"/>
+                <w:bCs w:val="0"/>
+                <w:sz w:val="21"/>
+                <w:szCs w:val="21"/>
+              </w:rPr>
+              <w:t xml:space="preserve">图 5  今日任务：连续学习天数、今日新词义进度与各题型待复习</w:t>
             </w:r>
           </w:p>
           <w:p>

</xml_diff>

<commit_message>
feat: add daily plan with due reviews, ten new senses and streak (#24)
今日任务（#23）：按用户时区的当天汇总待复习、每日 10 个新词义与连续学习天数，
全部由作答事实与学习状态计算，不新增业务表。

- GET /api/v1/me/today 与 /today 页面；按钮直接创建练习
- POST /api/v1/practice/sessions 新增 focus=new_senses：只出任何题型都未作答的词义
- 导航“今日”，概览页主按钮改为今日任务，练习小结可返回今日任务
- GLOSSARY、需求、接口、验收（T15）、日程、演示脚本同步；实验二报告加入今日任务与图 5
- evidence/exp02/today-http.*；handoff_check.sh 增加今日任务检查

证据中的 commit 号（ae75ade）为 squash 前的分支提交，代码与本次合并相同。

验收：T15

Co-Authored-By: Claude Opus 5.5 <noreply@anthropic.com>
</commit_message>
<xml_diff>
--- a/docs/reports/实验二_Web页面设计.docx
+++ b/docs/reports/实验二_Web页面设计.docx
@@ -6848,7 +6848,7 @@
                 <w:sz w:val="24"/>
                 <w:szCs w:val="24"/>
               </w:rPr>
-              <w:t xml:space="preserve">功能扩展：在登录的基础上，系统实现了注册、退出和完整的背单词学习闭环——选择目标词表、三类题型练习（服务端判分，作答与学习状态在同一事务中提交）、复习计划与统计。下表摘自答辩路径实测（evidence/exp02/review-path.txt）：</w:t>
+              <w:t xml:space="preserve">功能扩展：在登录的基础上，系统实现了注册、退出和完整的背单词学习闭环——选择目标词表、三类题型练习（服务端判分，作答与学习状态在同一事务中提交）、复习计划与统计，以及汇总当天待复习、每日 10 个新词义与连续学习天数的今日任务。下表摘自答辩路径与今日任务实测（evidence/exp02/review-path.txt、today-http.txt）：</w:t>
             </w:r>
           </w:p>
           <w:tbl>
@@ -7170,6 +7170,56 @@
                       <w:szCs w:val="18"/>
                     </w:rPr>
                     <w:t xml:space="preserve">学习状态与作答记录一致：核对 8 组（用户, 词义, 题型）。</w:t>
+                  </w:r>
+                </w:p>
+              </w:tc>
+            </w:tr>
+            <w:tr>
+              <w:tc>
+                <w:tcPr>
+                  <w:tcW w:w="3950" w:type="dxa"/>
+                </w:tcPr>
+                <w:p>
+                  <w:pPr>
+                    <w:spacing w:before="20" w:after="20" w:line="260" w:lineRule="auto"/>
+                    <w:jc w:val="start"/>
+                    <w:rPr>
+                      <w:sz w:val="18"/>
+                    </w:rPr>
+                  </w:pPr>
+                  <w:r>
+                    <w:rPr>
+                      <w:rFonts w:ascii="宋体" w:hAnsi="宋体" w:eastAsia="宋体" w:cs="宋体"/>
+                      <w:b w:val="0"/>
+                      <w:bCs w:val="0"/>
+                      <w:sz w:val="18"/>
+                      <w:szCs w:val="18"/>
+                    </w:rPr>
+                    <w:t xml:space="preserve">今日任务（新账户）</w:t>
+                  </w:r>
+                </w:p>
+              </w:tc>
+              <w:tc>
+                <w:tcPr>
+                  <w:tcW w:w="3950" w:type="dxa"/>
+                </w:tcPr>
+                <w:p>
+                  <w:pPr>
+                    <w:spacing w:before="20" w:after="20" w:line="260" w:lineRule="auto"/>
+                    <w:jc w:val="start"/>
+                    <w:rPr>
+                      <w:sz w:val="18"/>
+                    </w:rPr>
+                  </w:pPr>
+                  <w:r>
+                    <w:rPr>
+                      <w:rFonts w:ascii="宋体" w:hAnsi="宋体" w:eastAsia="宋体" w:cs="宋体"/>
+                      <w:b w:val="0"/>
+                      <w:bCs w:val="0"/>
+                      <w:sz w:val="18"/>
+                      <w:szCs w:val="18"/>
+                    </w:rPr>
+                    <w:t xml:space="preserve">新词义 0/10；完成 10 个新词义（2 题答错）后显示已完成，连续学习 1 天；再学新词时与已作答词义重叠 0 题</w:t>
                   </w:r>
                 </w:p>
               </w:tc>
@@ -7282,7 +7332,7 @@
             <w:r>
               <w:drawing>
                 <wp:inline distT="0" distB="0" distL="0" distR="0">
-                  <wp:extent cx="5016500" cy="3527226"/>
+                  <wp:extent cx="5016500" cy="4130774"/>
                   <wp:docPr id="5004" name="e2_review.png"/>
                   <wp:cNvGraphicFramePr>
                     <a:graphicFrameLocks xmlns:a="http://schemas.openxmlformats.org/drawingml/2006/main" noChangeAspect="1"/>
@@ -7303,7 +7353,7 @@
                         <pic:spPr>
                           <a:xfrm>
                             <a:off x="0" y="0"/>
-                            <a:ext cx="5016500" cy="3527226"/>
+                            <a:ext cx="5016500" cy="4130774"/>
                           </a:xfrm>
                           <a:prstGeom prst="rect">
                             <a:avLst/>
@@ -7342,6 +7392,84 @@
                 <w:szCs w:val="21"/>
               </w:rPr>
               <w:t xml:space="preserve">图 4  复习计划：已到期与未到期错题</w:t>
+            </w:r>
+          </w:p>
+          <w:p>
+            <w:pPr>
+              <w:pStyle w:val="Normal"/>
+              <w:widowControl/>
+              <w:keepNext/>
+              <w:spacing w:before="0" w:after="0" w:lineRule="auto" w:line="240"/>
+              <w:jc w:val="center"/>
+              <w:rPr>
+                <w:b w:val="0"/>
+                <w:sz w:val="24"/>
+                <w:szCs w:val="24"/>
+              </w:rPr>
+            </w:pPr>
+            <w:r>
+              <w:drawing>
+                <wp:inline distT="0" distB="0" distL="0" distR="0">
+                  <wp:extent cx="5016500" cy="3546822"/>
+                  <wp:docPr id="5005" name="e2_today.png"/>
+                  <wp:cNvGraphicFramePr>
+                    <a:graphicFrameLocks xmlns:a="http://schemas.openxmlformats.org/drawingml/2006/main" noChangeAspect="1"/>
+                  </wp:cNvGraphicFramePr>
+                  <a:graphic xmlns:a="http://schemas.openxmlformats.org/drawingml/2006/main">
+                    <a:graphicData uri="http://schemas.openxmlformats.org/drawingml/2006/picture">
+                      <pic:pic xmlns:pic="http://schemas.openxmlformats.org/drawingml/2006/picture">
+                        <pic:nvPicPr>
+                          <pic:cNvPr id="5005" name="e2_today.png"/>
+                          <pic:cNvPicPr/>
+                        </pic:nvPicPr>
+                        <pic:blipFill>
+                          <a:blip r:embed="rId11"/>
+                          <a:stretch>
+                            <a:fillRect/>
+                          </a:stretch>
+                        </pic:blipFill>
+                        <pic:spPr>
+                          <a:xfrm>
+                            <a:off x="0" y="0"/>
+                            <a:ext cx="5016500" cy="3546822"/>
+                          </a:xfrm>
+                          <a:prstGeom prst="rect">
+                            <a:avLst/>
+                          </a:prstGeom>
+                          <a:ln w="6350">
+                            <a:solidFill>
+                              <a:srgbClr val="BBBBBB"/>
+                            </a:solidFill>
+                          </a:ln>
+                        </pic:spPr>
+                      </pic:pic>
+                    </a:graphicData>
+                  </a:graphic>
+                </wp:inline>
+              </w:drawing>
+            </w:r>
+          </w:p>
+          <w:p>
+            <w:pPr>
+              <w:pStyle w:val="Normal"/>
+              <w:widowControl/>
+              <w:spacing w:before="0" w:after="120" w:lineRule="auto" w:line="300"/>
+              <w:jc w:val="center"/>
+              <w:rPr>
+                <w:b w:val="0"/>
+                <w:sz w:val="21"/>
+                <w:szCs w:val="21"/>
+              </w:rPr>
+            </w:pPr>
+            <w:r>
+              <w:rPr>
+                <w:rFonts w:ascii="宋体" w:hAnsi="宋体" w:eastAsia="宋体" w:cs="宋体"/>
+                <w:b w:val="0"/>
+                <w:bCs w:val="0"/>
+                <w:sz w:val="21"/>
+                <w:szCs w:val="21"/>
+              </w:rPr>
+              <w:t xml:space="preserve">图 5  今日任务：连续学习天数、今日新词义进度与各题型待复习</w:t>
             </w:r>
           </w:p>
           <w:p>

</xml_diff>

<commit_message>
fix: cap embedded report image height so full-page screenshots are not clipped (#45)
- docx_fill.py：_drawing() 增加约 6.2 英寸的高度上限，超过时按比例缩小宽度，保持纵横比

- 重新生成四份报告；实验二 PDF 由图 8 完整显示，页数 14、无空白尾页
</commit_message>
<xml_diff>
--- a/docs/reports/实验二_Web页面设计.docx
+++ b/docs/reports/实验二_Web页面设计.docx
@@ -7790,7 +7790,7 @@
             <w:r>
               <w:drawing>
                 <wp:inline distT="0" distB="0" distL="0" distR="0">
-                  <wp:extent cx="5016500" cy="12584360"/>
+                  <wp:extent cx="2259943" cy="5669280"/>
                   <wp:docPr id="5008" name="e2_insights.png"/>
                   <wp:cNvGraphicFramePr>
                     <a:graphicFrameLocks xmlns:a="http://schemas.openxmlformats.org/drawingml/2006/main" noChangeAspect="1"/>
@@ -7811,7 +7811,7 @@
                         <pic:spPr>
                           <a:xfrm>
                             <a:off x="0" y="0"/>
-                            <a:ext cx="5016500" cy="12584360"/>
+                            <a:ext cx="2259943" cy="5669280"/>
                           </a:xfrm>
                           <a:prstGeom prst="rect">
                             <a:avLst/>

</xml_diff>

<commit_message>
fix: cap embedded report image height so full-page screenshots are not clipped (#45) (#46)
- docx_fill.py：_drawing() 增加约 6.2 英寸的高度上限，超过时按比例缩小宽度，保持纵横比

- 重新生成四份报告；实验二 PDF 由图 8 完整显示，页数 14、无空白尾页
</commit_message>
<xml_diff>
--- a/docs/reports/实验二_Web页面设计.docx
+++ b/docs/reports/实验二_Web页面设计.docx
@@ -7790,7 +7790,7 @@
             <w:r>
               <w:drawing>
                 <wp:inline distT="0" distB="0" distL="0" distR="0">
-                  <wp:extent cx="5016500" cy="12584360"/>
+                  <wp:extent cx="2259943" cy="5669280"/>
                   <wp:docPr id="5008" name="e2_insights.png"/>
                   <wp:cNvGraphicFramePr>
                     <a:graphicFrameLocks xmlns:a="http://schemas.openxmlformats.org/drawingml/2006/main" noChangeAspect="1"/>
@@ -7811,7 +7811,7 @@
                         <pic:spPr>
                           <a:xfrm>
                             <a:off x="0" y="0"/>
-                            <a:ext cx="5016500" cy="12584360"/>
+                            <a:ext cx="2259943" cy="5669280"/>
                           </a:xfrm>
                           <a:prstGeom prst="rect">
                             <a:avLst/>

</xml_diff>

<commit_message>
docs: sync reports, data model diagram and demo notes to the formal wordbook (#49)
- 报告二新增“诊断驱动练习、正式词表与成对记忆”一节（数字取自 evidence/exp02/import-ky.txt 与 wordbook-http.txt），业务表改为 15 张；报告四注明线上索引扩至 6205 条、评价仍以 v2 语料为准
- 截图脚本加入 report_ky 账户：考研词表选择、adapt→adopt 拼写反馈与诊断页成对复习；重拍全部截图并重新生成四份报告
- 数据模型图加入 word_relations；README 与演示脚本的 Mac 隧道改用本地 5050（5000 被隔空播放占用）

Co-Authored-By: Claude Opus 5.5 <noreply@anthropic.com>
</commit_message>
<xml_diff>
--- a/docs/reports/实验二_Web页面设计.docx
+++ b/docs/reports/实验二_Web页面设计.docx
@@ -4190,7 +4190,7 @@
                 <w:sz w:val="24"/>
                 <w:szCs w:val="24"/>
               </w:rPr>
-              <w:t xml:space="preserve">项目数据库 vocab_review 运行在 MySQL 8.4（InnoDB、utf8mb4），表结构由按序编号的迁移脚本创建（flask db upgrade），共 14 张业务表，覆盖账户、词表与词义、题目版本、练习与作答、学习状态和模型推理记录。本实验涉及的用户表如下（SHOW CREATE TABLE 实际输出）：</w:t>
+              <w:t xml:space="preserve">项目数据库 vocab_review 运行在 MySQL 8.4（InnoDB、utf8mb4），表结构由按序编号的迁移脚本创建（flask db upgrade），共 15 张业务表，覆盖账户、词表与词义、词对、题目版本、练习与作答、学习状态和模型推理记录。本实验涉及的用户表如下（SHOW CREATE TABLE 实际输出）：</w:t>
             </w:r>
           </w:p>
           <w:p>
@@ -7406,7 +7406,7 @@
             <w:r>
               <w:drawing>
                 <wp:inline distT="0" distB="0" distL="0" distR="0">
-                  <wp:extent cx="5016500" cy="3723183"/>
+                  <wp:extent cx="5016500" cy="4013200"/>
                   <wp:docPr id="5004" name="e2_practice_feedback.png"/>
                   <wp:cNvGraphicFramePr>
                     <a:graphicFrameLocks xmlns:a="http://schemas.openxmlformats.org/drawingml/2006/main" noChangeAspect="1"/>
@@ -7427,7 +7427,7 @@
                         <pic:spPr>
                           <a:xfrm>
                             <a:off x="0" y="0"/>
-                            <a:ext cx="5016500" cy="3723183"/>
+                            <a:ext cx="5016500" cy="4013200"/>
                           </a:xfrm>
                           <a:prstGeom prst="rect">
                             <a:avLst/>
@@ -7484,7 +7484,7 @@
             <w:r>
               <w:drawing>
                 <wp:inline distT="0" distB="0" distL="0" distR="0">
-                  <wp:extent cx="5016500" cy="3527226"/>
+                  <wp:extent cx="4127803" cy="5669280"/>
                   <wp:docPr id="5005" name="e2_review.png"/>
                   <wp:cNvGraphicFramePr>
                     <a:graphicFrameLocks xmlns:a="http://schemas.openxmlformats.org/drawingml/2006/main" noChangeAspect="1"/>
@@ -7505,7 +7505,7 @@
                         <pic:spPr>
                           <a:xfrm>
                             <a:off x="0" y="0"/>
-                            <a:ext cx="5016500" cy="3527226"/>
+                            <a:ext cx="4127803" cy="5669280"/>
                           </a:xfrm>
                           <a:prstGeom prst="rect">
                             <a:avLst/>
@@ -7562,7 +7562,7 @@
             <w:r>
               <w:drawing>
                 <wp:inline distT="0" distB="0" distL="0" distR="0">
-                  <wp:extent cx="5016500" cy="4169965"/>
+                  <wp:extent cx="5016500" cy="4522688"/>
                   <wp:docPr id="5006" name="e2_today.png"/>
                   <wp:cNvGraphicFramePr>
                     <a:graphicFrameLocks xmlns:a="http://schemas.openxmlformats.org/drawingml/2006/main" noChangeAspect="1"/>
@@ -7583,7 +7583,7 @@
                         <pic:spPr>
                           <a:xfrm>
                             <a:off x="0" y="0"/>
-                            <a:ext cx="5016500" cy="4169965"/>
+                            <a:ext cx="5016500" cy="4522688"/>
                           </a:xfrm>
                           <a:prstGeom prst="rect">
                             <a:avLst/>
@@ -7790,7 +7790,7 @@
             <w:r>
               <w:drawing>
                 <wp:inline distT="0" distB="0" distL="0" distR="0">
-                  <wp:extent cx="2259943" cy="5669280"/>
+                  <wp:extent cx="1836204" cy="5669280"/>
                   <wp:docPr id="5008" name="e2_insights.png"/>
                   <wp:cNvGraphicFramePr>
                     <a:graphicFrameLocks xmlns:a="http://schemas.openxmlformats.org/drawingml/2006/main" noChangeAspect="1"/>
@@ -7811,7 +7811,7 @@
                         <pic:spPr>
                           <a:xfrm>
                             <a:off x="0" y="0"/>
-                            <a:ext cx="2259943" cy="5669280"/>
+                            <a:ext cx="1836204" cy="5669280"/>
                           </a:xfrm>
                           <a:prstGeom prst="rect">
                             <a:avLst/>
@@ -7873,7 +7873,570 @@
                 <w:sz w:val="24"/>
                 <w:szCs w:val="24"/>
               </w:rPr>
-              <w:t xml:space="preserve">5. 探讨分析</w:t>
+              <w:t xml:space="preserve">5. 诊断驱动练习、正式词表与成对记忆</w:t>
+            </w:r>
+          </w:p>
+          <w:p>
+            <w:pPr>
+              <w:pStyle w:val="Normal"/>
+              <w:widowControl/>
+              <w:spacing w:before="0" w:after="0" w:lineRule="auto" w:line="360"/>
+              <w:ind w:firstLine="480"/>
+              <w:jc w:val="start"/>
+              <w:rPr>
+                <w:b w:val="0"/>
+                <w:sz w:val="24"/>
+                <w:szCs w:val="24"/>
+              </w:rPr>
+            </w:pPr>
+            <w:r>
+              <w:rPr>
+                <w:rFonts w:ascii="宋体" w:hAnsi="宋体" w:eastAsia="宋体" w:cs="宋体"/>
+                <w:b w:val="0"/>
+                <w:bCs w:val="0"/>
+                <w:sz w:val="24"/>
+                <w:szCs w:val="24"/>
+              </w:rPr>
+              <w:t xml:space="preserve">诊断不止于展示：系统按「词义 × 题型」从作答事实计算当前证据（ADR 0003）——最近一次答错或最近 3 次错 2 次记为当前弱项，记忆强度沿用 Duolingo 半衰期回归的形式 p = 2^(−Δ/h)，系数手工设定、未经训练，只用于排序与解释。组卷时到期、错题与巩固项按记忆强度从低到高出题，每题记录选题理由；用户可从诊断页对某个弱项发起定向练习，或按题型做弱项专练。模型输出仍只作参考，不进入组卷与复习安排。</w:t>
+            </w:r>
+          </w:p>
+          <w:p>
+            <w:pPr>
+              <w:pStyle w:val="Normal"/>
+              <w:widowControl/>
+              <w:spacing w:before="0" w:after="0" w:lineRule="auto" w:line="360"/>
+              <w:ind w:firstLine="480"/>
+              <w:jc w:val="start"/>
+              <w:rPr>
+                <w:b w:val="0"/>
+                <w:sz w:val="24"/>
+                <w:szCs w:val="24"/>
+              </w:rPr>
+            </w:pPr>
+            <w:r>
+              <w:rPr>
+                <w:rFonts w:ascii="宋体" w:hAnsi="宋体" w:eastAsia="宋体" w:cs="宋体"/>
+                <w:b w:val="0"/>
+                <w:bCs w:val="0"/>
+                <w:sz w:val="24"/>
+                <w:szCs w:val="24"/>
+              </w:rPr>
+              <w:t xml:space="preserve">演示词库学完后，系统接入正式考研词表（ADR 0004）：取开源词典 ECDICT（MIT 许可）中标为考研的 4778 个词条，中文释义按词性拆成词义，例句取 Tatoeba 中英句对（CC BY 2.0 FR），三类题目由规则生成。导入在一个事务内完成，新增 4611 个词条、6034 个词义、5775 条例句与 15440 道题，已有的 167 个演示词条沿用原有词义与题目，演示内容全部未变（evidence/exp02/import-ky.txt）。</w:t>
+            </w:r>
+          </w:p>
+          <w:p>
+            <w:pPr>
+              <w:pStyle w:val="Normal"/>
+              <w:widowControl/>
+              <w:spacing w:before="0" w:after="0" w:lineRule="auto" w:line="360"/>
+              <w:ind w:firstLine="480"/>
+              <w:jc w:val="start"/>
+              <w:rPr>
+                <w:b w:val="0"/>
+                <w:sz w:val="24"/>
+                <w:szCs w:val="24"/>
+              </w:rPr>
+            </w:pPr>
+            <w:r>
+              <w:rPr>
+                <w:rFonts w:ascii="宋体" w:hAnsi="宋体" w:eastAsia="宋体" w:cs="宋体"/>
+                <w:b w:val="0"/>
+                <w:bCs w:val="0"/>
+                <w:sz w:val="24"/>
+                <w:szCs w:val="24"/>
+              </w:rPr>
+              <w:t xml:space="preserve">为支持成对记忆，迁移 0003 新增 word_relations 表（两个外键指向 words，word_id_a &lt; word_id_b，(word_id_a, word_id_b, relation_type) 唯一），共 3179 个词对：近义 1124、同族 585、形近 1470。近义与同族取 WordNet 3.0，形近按拼写编辑距离计算并排除词形变化与前后缀变化。辨义题的干扰项优先取形近词的释义，答题反馈列出该词的词对；诊断页对每个当前弱项列出目标词表内的词对及其当前证据，可一键把它们放进同一组定向练习。</w:t>
+            </w:r>
+          </w:p>
+          <w:tbl>
+            <w:tblPr>
+              <w:tblW w:w="7900" w:type="dxa"/>
+              <w:tblBorders>
+                <w:top w:val="single" w:sz="4" w:space="0" w:color="999999"/>
+                <w:left w:val="single" w:sz="4" w:space="0" w:color="999999"/>
+                <w:bottom w:val="single" w:sz="4" w:space="0" w:color="999999"/>
+                <w:right w:val="single" w:sz="4" w:space="0" w:color="999999"/>
+                <w:insideH w:val="single" w:sz="4" w:space="0" w:color="999999"/>
+                <w:insideV w:val="single" w:sz="4" w:space="0" w:color="999999"/>
+              </w:tblBorders>
+              <w:tblLayout w:type="fixed"/>
+              <w:tblCellMar>
+                <w:left w:w="80" w:type="dxa"/>
+                <w:right w:w="80" w:type="dxa"/>
+              </w:tblCellMar>
+            </w:tblPr>
+            <w:tblGrid>
+              <w:gridCol w:w="3950"/>
+              <w:gridCol w:w="3950"/>
+            </w:tblGrid>
+            <w:tr>
+              <w:tc>
+                <w:tcPr>
+                  <w:tcW w:w="3950" w:type="dxa"/>
+                  <w:shd w:val="clear" w:color="auto" w:fill="E7EEE9"/>
+                </w:tcPr>
+                <w:p>
+                  <w:pPr>
+                    <w:spacing w:before="20" w:after="20" w:line="260" w:lineRule="auto"/>
+                    <w:jc w:val="start"/>
+                    <w:rPr>
+                      <w:sz w:val="18"/>
+                    </w:rPr>
+                  </w:pPr>
+                  <w:r>
+                    <w:rPr>
+                      <w:rFonts w:ascii="宋体" w:hAnsi="宋体" w:eastAsia="宋体" w:cs="宋体"/>
+                      <w:b/>
+                      <w:bCs/>
+                      <w:sz w:val="18"/>
+                      <w:szCs w:val="18"/>
+                    </w:rPr>
+                    <w:t xml:space="preserve">环节（evidence/exp02/wordbook-http.txt）</w:t>
+                  </w:r>
+                </w:p>
+              </w:tc>
+              <w:tc>
+                <w:tcPr>
+                  <w:tcW w:w="3950" w:type="dxa"/>
+                  <w:shd w:val="clear" w:color="auto" w:fill="E7EEE9"/>
+                </w:tcPr>
+                <w:p>
+                  <w:pPr>
+                    <w:spacing w:before="20" w:after="20" w:line="260" w:lineRule="auto"/>
+                    <w:jc w:val="start"/>
+                    <w:rPr>
+                      <w:sz w:val="18"/>
+                    </w:rPr>
+                  </w:pPr>
+                  <w:r>
+                    <w:rPr>
+                      <w:rFonts w:ascii="宋体" w:hAnsi="宋体" w:eastAsia="宋体" w:cs="宋体"/>
+                      <w:b/>
+                      <w:bCs/>
+                      <w:sz w:val="18"/>
+                      <w:szCs w:val="18"/>
+                    </w:rPr>
+                    <w:t xml:space="preserve">实测结果</w:t>
+                  </w:r>
+                </w:p>
+              </w:tc>
+            </w:tr>
+            <w:tr>
+              <w:tc>
+                <w:tcPr>
+                  <w:tcW w:w="3950" w:type="dxa"/>
+                </w:tcPr>
+                <w:p>
+                  <w:pPr>
+                    <w:spacing w:before="20" w:after="20" w:line="260" w:lineRule="auto"/>
+                    <w:jc w:val="start"/>
+                    <w:rPr>
+                      <w:sz w:val="18"/>
+                    </w:rPr>
+                  </w:pPr>
+                  <w:r>
+                    <w:rPr>
+                      <w:rFonts w:ascii="宋体" w:hAnsi="宋体" w:eastAsia="宋体" w:cs="宋体"/>
+                      <w:b w:val="0"/>
+                      <w:bCs w:val="0"/>
+                      <w:sz w:val="18"/>
+                      <w:szCs w:val="18"/>
+                    </w:rPr>
+                    <w:t xml:space="preserve">新账户只选考研词表</w:t>
+                  </w:r>
+                </w:p>
+              </w:tc>
+              <w:tc>
+                <w:tcPr>
+                  <w:tcW w:w="3950" w:type="dxa"/>
+                </w:tcPr>
+                <w:p>
+                  <w:pPr>
+                    <w:spacing w:before="20" w:after="20" w:line="260" w:lineRule="auto"/>
+                    <w:jc w:val="start"/>
+                    <w:rPr>
+                      <w:sz w:val="18"/>
+                    </w:rPr>
+                  </w:pPr>
+                  <w:r>
+                    <w:rPr>
+                      <w:rFonts w:ascii="宋体" w:hAnsi="宋体" w:eastAsia="宋体" w:cs="宋体"/>
+                      <w:b w:val="0"/>
+                      <w:bCs w:val="0"/>
+                      <w:sz w:val="18"/>
+                      <w:szCs w:val="18"/>
+                    </w:rPr>
+                    <w:t xml:space="preserve">考研词表（ECDICT）4778 个词条</w:t>
+                  </w:r>
+                </w:p>
+              </w:tc>
+            </w:tr>
+            <w:tr>
+              <w:tc>
+                <w:tcPr>
+                  <w:tcW w:w="3950" w:type="dxa"/>
+                </w:tcPr>
+                <w:p>
+                  <w:pPr>
+                    <w:spacing w:before="20" w:after="20" w:line="260" w:lineRule="auto"/>
+                    <w:jc w:val="start"/>
+                    <w:rPr>
+                      <w:sz w:val="18"/>
+                    </w:rPr>
+                  </w:pPr>
+                  <w:r>
+                    <w:rPr>
+                      <w:rFonts w:ascii="宋体" w:hAnsi="宋体" w:eastAsia="宋体" w:cs="宋体"/>
+                      <w:b w:val="0"/>
+                      <w:bCs w:val="0"/>
+                      <w:sz w:val="18"/>
+                      <w:szCs w:val="18"/>
+                    </w:rPr>
+                    <w:t xml:space="preserve">辨义 10 题，一题故意答错</w:t>
+                  </w:r>
+                </w:p>
+              </w:tc>
+              <w:tc>
+                <w:tcPr>
+                  <w:tcW w:w="3950" w:type="dxa"/>
+                </w:tcPr>
+                <w:p>
+                  <w:pPr>
+                    <w:spacing w:before="20" w:after="20" w:line="260" w:lineRule="auto"/>
+                    <w:jc w:val="start"/>
+                    <w:rPr>
+                      <w:sz w:val="18"/>
+                    </w:rPr>
+                  </w:pPr>
+                  <w:r>
+                    <w:rPr>
+                      <w:rFonts w:ascii="宋体" w:hAnsi="宋体" w:eastAsia="宋体" w:cs="宋体"/>
+                      <w:b w:val="0"/>
+                      <w:bCs w:val="0"/>
+                      <w:sz w:val="18"/>
+                      <w:szCs w:val="18"/>
+                    </w:rPr>
+                    <w:t xml:space="preserve">predecessor 答错，反馈列出词对：同族 precede</w:t>
+                  </w:r>
+                </w:p>
+              </w:tc>
+            </w:tr>
+            <w:tr>
+              <w:tc>
+                <w:tcPr>
+                  <w:tcW w:w="3950" w:type="dxa"/>
+                </w:tcPr>
+                <w:p>
+                  <w:pPr>
+                    <w:spacing w:before="20" w:after="20" w:line="260" w:lineRule="auto"/>
+                    <w:jc w:val="start"/>
+                    <w:rPr>
+                      <w:sz w:val="18"/>
+                    </w:rPr>
+                  </w:pPr>
+                  <w:r>
+                    <w:rPr>
+                      <w:rFonts w:ascii="宋体" w:hAnsi="宋体" w:eastAsia="宋体" w:cs="宋体"/>
+                      <w:b w:val="0"/>
+                      <w:bCs w:val="0"/>
+                      <w:sz w:val="18"/>
+                      <w:szCs w:val="18"/>
+                    </w:rPr>
+                    <w:t xml:space="preserve">诊断页成对复习</w:t>
+                  </w:r>
+                </w:p>
+              </w:tc>
+              <w:tc>
+                <w:tcPr>
+                  <w:tcW w:w="3950" w:type="dxa"/>
+                </w:tcPr>
+                <w:p>
+                  <w:pPr>
+                    <w:spacing w:before="20" w:after="20" w:line="260" w:lineRule="auto"/>
+                    <w:jc w:val="start"/>
+                    <w:rPr>
+                      <w:sz w:val="18"/>
+                    </w:rPr>
+                  </w:pPr>
+                  <w:r>
+                    <w:rPr>
+                      <w:rFonts w:ascii="宋体" w:hAnsi="宋体" w:eastAsia="宋体" w:cs="宋体"/>
+                      <w:b w:val="0"/>
+                      <w:bCs w:val="0"/>
+                      <w:sz w:val="18"/>
+                      <w:szCs w:val="18"/>
+                    </w:rPr>
+                    <w:t xml:space="preserve">当前弱项 predecessor，词对：同族 precede（未练）</w:t>
+                  </w:r>
+                </w:p>
+              </w:tc>
+            </w:tr>
+            <w:tr>
+              <w:tc>
+                <w:tcPr>
+                  <w:tcW w:w="3950" w:type="dxa"/>
+                </w:tcPr>
+                <w:p>
+                  <w:pPr>
+                    <w:spacing w:before="20" w:after="20" w:line="260" w:lineRule="auto"/>
+                    <w:jc w:val="start"/>
+                    <w:rPr>
+                      <w:sz w:val="18"/>
+                    </w:rPr>
+                  </w:pPr>
+                  <w:r>
+                    <w:rPr>
+                      <w:rFonts w:ascii="宋体" w:hAnsi="宋体" w:eastAsia="宋体" w:cs="宋体"/>
+                      <w:b w:val="0"/>
+                      <w:bCs w:val="0"/>
+                      <w:sz w:val="18"/>
+                      <w:szCs w:val="18"/>
+                    </w:rPr>
+                    <w:t xml:space="preserve">发起成对练习</w:t>
+                  </w:r>
+                </w:p>
+              </w:tc>
+              <w:tc>
+                <w:tcPr>
+                  <w:tcW w:w="3950" w:type="dxa"/>
+                </w:tcPr>
+                <w:p>
+                  <w:pPr>
+                    <w:spacing w:before="20" w:after="20" w:line="260" w:lineRule="auto"/>
+                    <w:jc w:val="start"/>
+                    <w:rPr>
+                      <w:sz w:val="18"/>
+                    </w:rPr>
+                  </w:pPr>
+                  <w:r>
+                    <w:rPr>
+                      <w:rFonts w:ascii="宋体" w:hAnsi="宋体" w:eastAsia="宋体" w:cs="宋体"/>
+                      <w:b w:val="0"/>
+                      <w:bCs w:val="0"/>
+                      <w:sz w:val="18"/>
+                      <w:szCs w:val="18"/>
+                    </w:rPr>
+                    <w:t xml:space="preserve">2 题，选题理由均为定向练习（targeted）</w:t>
+                  </w:r>
+                </w:p>
+              </w:tc>
+            </w:tr>
+          </w:tbl>
+          <w:p>
+            <w:pPr>
+              <w:pStyle w:val="Normal"/>
+              <w:widowControl/>
+              <w:spacing w:before="0" w:after="0" w:lineRule="auto" w:line="240"/>
+              <w:jc w:val="start"/>
+              <w:rPr>
+                <w:b w:val="0"/>
+                <w:sz w:val="12"/>
+                <w:szCs w:val="12"/>
+              </w:rPr>
+            </w:pPr>
+          </w:p>
+          <w:p>
+            <w:pPr>
+              <w:pStyle w:val="Normal"/>
+              <w:widowControl/>
+              <w:keepNext/>
+              <w:spacing w:before="0" w:after="0" w:lineRule="auto" w:line="240"/>
+              <w:jc w:val="center"/>
+              <w:rPr>
+                <w:b w:val="0"/>
+                <w:sz w:val="24"/>
+                <w:szCs w:val="24"/>
+              </w:rPr>
+            </w:pPr>
+            <w:r>
+              <w:drawing>
+                <wp:inline distT="0" distB="0" distL="0" distR="0">
+                  <wp:extent cx="5016500" cy="3527226"/>
+                  <wp:docPr id="5009" name="e2_paired_feedback.png"/>
+                  <wp:cNvGraphicFramePr>
+                    <a:graphicFrameLocks xmlns:a="http://schemas.openxmlformats.org/drawingml/2006/main" noChangeAspect="1"/>
+                  </wp:cNvGraphicFramePr>
+                  <a:graphic xmlns:a="http://schemas.openxmlformats.org/drawingml/2006/main">
+                    <a:graphicData uri="http://schemas.openxmlformats.org/drawingml/2006/picture">
+                      <pic:pic xmlns:pic="http://schemas.openxmlformats.org/drawingml/2006/picture">
+                        <pic:nvPicPr>
+                          <pic:cNvPr id="5009" name="e2_paired_feedback.png"/>
+                          <pic:cNvPicPr/>
+                        </pic:nvPicPr>
+                        <pic:blipFill>
+                          <a:blip r:embed="rId15"/>
+                          <a:stretch>
+                            <a:fillRect/>
+                          </a:stretch>
+                        </pic:blipFill>
+                        <pic:spPr>
+                          <a:xfrm>
+                            <a:off x="0" y="0"/>
+                            <a:ext cx="5016500" cy="3527226"/>
+                          </a:xfrm>
+                          <a:prstGeom prst="rect">
+                            <a:avLst/>
+                          </a:prstGeom>
+                          <a:ln w="6350">
+                            <a:solidFill>
+                              <a:srgbClr val="BBBBBB"/>
+                            </a:solidFill>
+                          </a:ln>
+                        </pic:spPr>
+                      </pic:pic>
+                    </a:graphicData>
+                  </a:graphic>
+                </wp:inline>
+              </w:drawing>
+            </w:r>
+          </w:p>
+          <w:p>
+            <w:pPr>
+              <w:pStyle w:val="Normal"/>
+              <w:widowControl/>
+              <w:spacing w:before="0" w:after="120" w:lineRule="auto" w:line="300"/>
+              <w:jc w:val="center"/>
+              <w:rPr>
+                <w:b w:val="0"/>
+                <w:sz w:val="21"/>
+                <w:szCs w:val="21"/>
+              </w:rPr>
+            </w:pPr>
+            <w:r>
+              <w:rPr>
+                <w:rFonts w:ascii="宋体" w:hAnsi="宋体" w:eastAsia="宋体" w:cs="宋体"/>
+                <w:b w:val="0"/>
+                <w:bCs w:val="0"/>
+                <w:sz w:val="21"/>
+                <w:szCs w:val="21"/>
+              </w:rPr>
+              <w:t xml:space="preserve">图 9  拼写题把 adapt 写成形近词 adopt：反馈列出形近、近义词及释义</w:t>
+            </w:r>
+          </w:p>
+          <w:p>
+            <w:pPr>
+              <w:pStyle w:val="Normal"/>
+              <w:widowControl/>
+              <w:keepNext/>
+              <w:spacing w:before="0" w:after="0" w:lineRule="auto" w:line="240"/>
+              <w:jc w:val="center"/>
+              <w:rPr>
+                <w:b w:val="0"/>
+                <w:sz w:val="24"/>
+                <w:szCs w:val="24"/>
+              </w:rPr>
+            </w:pPr>
+            <w:r>
+              <w:drawing>
+                <wp:inline distT="0" distB="0" distL="0" distR="0">
+                  <wp:extent cx="5016500" cy="1029702"/>
+                  <wp:docPr id="5010" name="e2_paired_insights.png"/>
+                  <wp:cNvGraphicFramePr>
+                    <a:graphicFrameLocks xmlns:a="http://schemas.openxmlformats.org/drawingml/2006/main" noChangeAspect="1"/>
+                  </wp:cNvGraphicFramePr>
+                  <a:graphic xmlns:a="http://schemas.openxmlformats.org/drawingml/2006/main">
+                    <a:graphicData uri="http://schemas.openxmlformats.org/drawingml/2006/picture">
+                      <pic:pic xmlns:pic="http://schemas.openxmlformats.org/drawingml/2006/picture">
+                        <pic:nvPicPr>
+                          <pic:cNvPr id="5010" name="e2_paired_insights.png"/>
+                          <pic:cNvPicPr/>
+                        </pic:nvPicPr>
+                        <pic:blipFill>
+                          <a:blip r:embed="rId16"/>
+                          <a:stretch>
+                            <a:fillRect/>
+                          </a:stretch>
+                        </pic:blipFill>
+                        <pic:spPr>
+                          <a:xfrm>
+                            <a:off x="0" y="0"/>
+                            <a:ext cx="5016500" cy="1029702"/>
+                          </a:xfrm>
+                          <a:prstGeom prst="rect">
+                            <a:avLst/>
+                          </a:prstGeom>
+                          <a:ln w="6350">
+                            <a:solidFill>
+                              <a:srgbClr val="BBBBBB"/>
+                            </a:solidFill>
+                          </a:ln>
+                        </pic:spPr>
+                      </pic:pic>
+                    </a:graphicData>
+                  </a:graphic>
+                </wp:inline>
+              </w:drawing>
+            </w:r>
+          </w:p>
+          <w:p>
+            <w:pPr>
+              <w:pStyle w:val="Normal"/>
+              <w:widowControl/>
+              <w:spacing w:before="0" w:after="120" w:lineRule="auto" w:line="300"/>
+              <w:jc w:val="center"/>
+              <w:rPr>
+                <w:b w:val="0"/>
+                <w:sz w:val="21"/>
+                <w:szCs w:val="21"/>
+              </w:rPr>
+            </w:pPr>
+            <w:r>
+              <w:rPr>
+                <w:rFonts w:ascii="宋体" w:hAnsi="宋体" w:eastAsia="宋体" w:cs="宋体"/>
+                <w:b w:val="0"/>
+                <w:bCs w:val="0"/>
+                <w:sz w:val="21"/>
+                <w:szCs w:val="21"/>
+              </w:rPr>
+              <w:t xml:space="preserve">图 10  诊断页“成对复习”：弱项 adapt 与目标词表内的词对，可发起成对练习</w:t>
+            </w:r>
+          </w:p>
+          <w:p>
+            <w:pPr>
+              <w:pStyle w:val="Normal"/>
+              <w:widowControl/>
+              <w:spacing w:before="0" w:after="0" w:lineRule="auto" w:line="360"/>
+              <w:ind w:firstLine="480"/>
+              <w:jc w:val="start"/>
+              <w:rPr>
+                <w:b w:val="0"/>
+                <w:sz w:val="24"/>
+                <w:szCs w:val="24"/>
+              </w:rPr>
+            </w:pPr>
+            <w:r>
+              <w:rPr>
+                <w:rFonts w:ascii="宋体" w:hAnsi="宋体" w:eastAsia="宋体" w:cs="宋体"/>
+                <w:b w:val="0"/>
+                <w:bCs w:val="0"/>
+                <w:sz w:val="24"/>
+                <w:szCs w:val="24"/>
+              </w:rPr>
+              <w:t xml:space="preserve">词对与题目都由规则生成，没有逐条人工复核；WordNet 的近义含部分较宽的义项，因此页面称“词对”而不称“易混词”。词对只决定展示和用户主动发起的练习，不改变默认组卷、复习规则与学习状态。</w:t>
+            </w:r>
+          </w:p>
+          <w:p>
+            <w:pPr>
+              <w:pStyle w:val="Normal"/>
+              <w:widowControl/>
+              <w:keepNext/>
+              <w:spacing w:before="0" w:after="0" w:lineRule="auto" w:line="360"/>
+              <w:jc w:val="start"/>
+              <w:rPr>
+                <w:b w:val="0"/>
+                <w:sz w:val="24"/>
+                <w:szCs w:val="24"/>
+              </w:rPr>
+            </w:pPr>
+            <w:r>
+              <w:rPr>
+                <w:rFonts w:ascii="宋体" w:hAnsi="宋体" w:eastAsia="宋体" w:cs="宋体"/>
+                <w:b/>
+                <w:bCs/>
+                <w:sz w:val="24"/>
+                <w:szCs w:val="24"/>
+              </w:rPr>
+              <w:t xml:space="preserve">6. 探讨分析</w:t>
             </w:r>
           </w:p>
           <w:p>

</xml_diff>

<commit_message>
feat: add ECDICT postgraduate wordbook and word relations for paired review (#50)
* feat: add ECDICT postgraduate wordbook and word relations for paired review (#49)

- 新增考研词表内容包（ECDICT ky 标签 4778 词条，Tatoeba 例句，WordNet 近义/同族，拼写编辑距离形近）与可复现构建脚本；原始数据不入库
- 迁移 0003 新增 word_relations，内容包支持 relations.csv
- 练习反馈列出词对；诊断页给出成对复习建议并可发起成对练习，误选标注词对关系
- ADR 0004、术语表、数据模型、接口、内容格式、演示脚本与证据同步

验收：T12、T18；完整检查 238 passed 无跳过，干净环境交接检查通过

Co-Authored-By: Claude Opus 5.5 <noreply@anthropic.com>

* docs: sync reports, data model diagram and demo notes to the formal wordbook (#49)

- 报告二新增“诊断驱动练习、正式词表与成对记忆”一节（数字取自 evidence/exp02/import-ky.txt 与 wordbook-http.txt），业务表改为 15 张；报告四注明线上索引扩至 6205 条、评价仍以 v2 语料为准
- 截图脚本加入 report_ky 账户：考研词表选择、adapt→adopt 拼写反馈与诊断页成对复习；重拍全部截图并重新生成四份报告
- 数据模型图加入 word_relations；README 与演示脚本的 Mac 隧道改用本地 5050（5000 被隔空播放占用）

Co-Authored-By: Claude Opus 5.5 <noreply@anthropic.com>

---------

Co-authored-by: Claude Opus 5.5 <noreply@anthropic.com>
</commit_message>
<xml_diff>
--- a/docs/reports/实验二_Web页面设计.docx
+++ b/docs/reports/实验二_Web页面设计.docx
@@ -4190,7 +4190,7 @@
                 <w:sz w:val="24"/>
                 <w:szCs w:val="24"/>
               </w:rPr>
-              <w:t xml:space="preserve">项目数据库 vocab_review 运行在 MySQL 8.4（InnoDB、utf8mb4），表结构由按序编号的迁移脚本创建（flask db upgrade），共 14 张业务表，覆盖账户、词表与词义、题目版本、练习与作答、学习状态和模型推理记录。本实验涉及的用户表如下（SHOW CREATE TABLE 实际输出）：</w:t>
+              <w:t xml:space="preserve">项目数据库 vocab_review 运行在 MySQL 8.4（InnoDB、utf8mb4），表结构由按序编号的迁移脚本创建（flask db upgrade），共 15 张业务表，覆盖账户、词表与词义、词对、题目版本、练习与作答、学习状态和模型推理记录。本实验涉及的用户表如下（SHOW CREATE TABLE 实际输出）：</w:t>
             </w:r>
           </w:p>
           <w:p>
@@ -7406,7 +7406,7 @@
             <w:r>
               <w:drawing>
                 <wp:inline distT="0" distB="0" distL="0" distR="0">
-                  <wp:extent cx="5016500" cy="3723183"/>
+                  <wp:extent cx="5016500" cy="4013200"/>
                   <wp:docPr id="5004" name="e2_practice_feedback.png"/>
                   <wp:cNvGraphicFramePr>
                     <a:graphicFrameLocks xmlns:a="http://schemas.openxmlformats.org/drawingml/2006/main" noChangeAspect="1"/>
@@ -7427,7 +7427,7 @@
                         <pic:spPr>
                           <a:xfrm>
                             <a:off x="0" y="0"/>
-                            <a:ext cx="5016500" cy="3723183"/>
+                            <a:ext cx="5016500" cy="4013200"/>
                           </a:xfrm>
                           <a:prstGeom prst="rect">
                             <a:avLst/>
@@ -7484,7 +7484,7 @@
             <w:r>
               <w:drawing>
                 <wp:inline distT="0" distB="0" distL="0" distR="0">
-                  <wp:extent cx="5016500" cy="3527226"/>
+                  <wp:extent cx="4127803" cy="5669280"/>
                   <wp:docPr id="5005" name="e2_review.png"/>
                   <wp:cNvGraphicFramePr>
                     <a:graphicFrameLocks xmlns:a="http://schemas.openxmlformats.org/drawingml/2006/main" noChangeAspect="1"/>
@@ -7505,7 +7505,7 @@
                         <pic:spPr>
                           <a:xfrm>
                             <a:off x="0" y="0"/>
-                            <a:ext cx="5016500" cy="3527226"/>
+                            <a:ext cx="4127803" cy="5669280"/>
                           </a:xfrm>
                           <a:prstGeom prst="rect">
                             <a:avLst/>
@@ -7562,7 +7562,7 @@
             <w:r>
               <w:drawing>
                 <wp:inline distT="0" distB="0" distL="0" distR="0">
-                  <wp:extent cx="5016500" cy="4169965"/>
+                  <wp:extent cx="5016500" cy="4522688"/>
                   <wp:docPr id="5006" name="e2_today.png"/>
                   <wp:cNvGraphicFramePr>
                     <a:graphicFrameLocks xmlns:a="http://schemas.openxmlformats.org/drawingml/2006/main" noChangeAspect="1"/>
@@ -7583,7 +7583,7 @@
                         <pic:spPr>
                           <a:xfrm>
                             <a:off x="0" y="0"/>
-                            <a:ext cx="5016500" cy="4169965"/>
+                            <a:ext cx="5016500" cy="4522688"/>
                           </a:xfrm>
                           <a:prstGeom prst="rect">
                             <a:avLst/>
@@ -7790,7 +7790,7 @@
             <w:r>
               <w:drawing>
                 <wp:inline distT="0" distB="0" distL="0" distR="0">
-                  <wp:extent cx="2259943" cy="5669280"/>
+                  <wp:extent cx="1836204" cy="5669280"/>
                   <wp:docPr id="5008" name="e2_insights.png"/>
                   <wp:cNvGraphicFramePr>
                     <a:graphicFrameLocks xmlns:a="http://schemas.openxmlformats.org/drawingml/2006/main" noChangeAspect="1"/>
@@ -7811,7 +7811,7 @@
                         <pic:spPr>
                           <a:xfrm>
                             <a:off x="0" y="0"/>
-                            <a:ext cx="2259943" cy="5669280"/>
+                            <a:ext cx="1836204" cy="5669280"/>
                           </a:xfrm>
                           <a:prstGeom prst="rect">
                             <a:avLst/>
@@ -7873,7 +7873,570 @@
                 <w:sz w:val="24"/>
                 <w:szCs w:val="24"/>
               </w:rPr>
-              <w:t xml:space="preserve">5. 探讨分析</w:t>
+              <w:t xml:space="preserve">5. 诊断驱动练习、正式词表与成对记忆</w:t>
+            </w:r>
+          </w:p>
+          <w:p>
+            <w:pPr>
+              <w:pStyle w:val="Normal"/>
+              <w:widowControl/>
+              <w:spacing w:before="0" w:after="0" w:lineRule="auto" w:line="360"/>
+              <w:ind w:firstLine="480"/>
+              <w:jc w:val="start"/>
+              <w:rPr>
+                <w:b w:val="0"/>
+                <w:sz w:val="24"/>
+                <w:szCs w:val="24"/>
+              </w:rPr>
+            </w:pPr>
+            <w:r>
+              <w:rPr>
+                <w:rFonts w:ascii="宋体" w:hAnsi="宋体" w:eastAsia="宋体" w:cs="宋体"/>
+                <w:b w:val="0"/>
+                <w:bCs w:val="0"/>
+                <w:sz w:val="24"/>
+                <w:szCs w:val="24"/>
+              </w:rPr>
+              <w:t xml:space="preserve">诊断不止于展示：系统按「词义 × 题型」从作答事实计算当前证据（ADR 0003）——最近一次答错或最近 3 次错 2 次记为当前弱项，记忆强度沿用 Duolingo 半衰期回归的形式 p = 2^(−Δ/h)，系数手工设定、未经训练，只用于排序与解释。组卷时到期、错题与巩固项按记忆强度从低到高出题，每题记录选题理由；用户可从诊断页对某个弱项发起定向练习，或按题型做弱项专练。模型输出仍只作参考，不进入组卷与复习安排。</w:t>
+            </w:r>
+          </w:p>
+          <w:p>
+            <w:pPr>
+              <w:pStyle w:val="Normal"/>
+              <w:widowControl/>
+              <w:spacing w:before="0" w:after="0" w:lineRule="auto" w:line="360"/>
+              <w:ind w:firstLine="480"/>
+              <w:jc w:val="start"/>
+              <w:rPr>
+                <w:b w:val="0"/>
+                <w:sz w:val="24"/>
+                <w:szCs w:val="24"/>
+              </w:rPr>
+            </w:pPr>
+            <w:r>
+              <w:rPr>
+                <w:rFonts w:ascii="宋体" w:hAnsi="宋体" w:eastAsia="宋体" w:cs="宋体"/>
+                <w:b w:val="0"/>
+                <w:bCs w:val="0"/>
+                <w:sz w:val="24"/>
+                <w:szCs w:val="24"/>
+              </w:rPr>
+              <w:t xml:space="preserve">演示词库学完后，系统接入正式考研词表（ADR 0004）：取开源词典 ECDICT（MIT 许可）中标为考研的 4778 个词条，中文释义按词性拆成词义，例句取 Tatoeba 中英句对（CC BY 2.0 FR），三类题目由规则生成。导入在一个事务内完成，新增 4611 个词条、6034 个词义、5775 条例句与 15440 道题，已有的 167 个演示词条沿用原有词义与题目，演示内容全部未变（evidence/exp02/import-ky.txt）。</w:t>
+            </w:r>
+          </w:p>
+          <w:p>
+            <w:pPr>
+              <w:pStyle w:val="Normal"/>
+              <w:widowControl/>
+              <w:spacing w:before="0" w:after="0" w:lineRule="auto" w:line="360"/>
+              <w:ind w:firstLine="480"/>
+              <w:jc w:val="start"/>
+              <w:rPr>
+                <w:b w:val="0"/>
+                <w:sz w:val="24"/>
+                <w:szCs w:val="24"/>
+              </w:rPr>
+            </w:pPr>
+            <w:r>
+              <w:rPr>
+                <w:rFonts w:ascii="宋体" w:hAnsi="宋体" w:eastAsia="宋体" w:cs="宋体"/>
+                <w:b w:val="0"/>
+                <w:bCs w:val="0"/>
+                <w:sz w:val="24"/>
+                <w:szCs w:val="24"/>
+              </w:rPr>
+              <w:t xml:space="preserve">为支持成对记忆，迁移 0003 新增 word_relations 表（两个外键指向 words，word_id_a &lt; word_id_b，(word_id_a, word_id_b, relation_type) 唯一），共 3179 个词对：近义 1124、同族 585、形近 1470。近义与同族取 WordNet 3.0，形近按拼写编辑距离计算并排除词形变化与前后缀变化。辨义题的干扰项优先取形近词的释义，答题反馈列出该词的词对；诊断页对每个当前弱项列出目标词表内的词对及其当前证据，可一键把它们放进同一组定向练习。</w:t>
+            </w:r>
+          </w:p>
+          <w:tbl>
+            <w:tblPr>
+              <w:tblW w:w="7900" w:type="dxa"/>
+              <w:tblBorders>
+                <w:top w:val="single" w:sz="4" w:space="0" w:color="999999"/>
+                <w:left w:val="single" w:sz="4" w:space="0" w:color="999999"/>
+                <w:bottom w:val="single" w:sz="4" w:space="0" w:color="999999"/>
+                <w:right w:val="single" w:sz="4" w:space="0" w:color="999999"/>
+                <w:insideH w:val="single" w:sz="4" w:space="0" w:color="999999"/>
+                <w:insideV w:val="single" w:sz="4" w:space="0" w:color="999999"/>
+              </w:tblBorders>
+              <w:tblLayout w:type="fixed"/>
+              <w:tblCellMar>
+                <w:left w:w="80" w:type="dxa"/>
+                <w:right w:w="80" w:type="dxa"/>
+              </w:tblCellMar>
+            </w:tblPr>
+            <w:tblGrid>
+              <w:gridCol w:w="3950"/>
+              <w:gridCol w:w="3950"/>
+            </w:tblGrid>
+            <w:tr>
+              <w:tc>
+                <w:tcPr>
+                  <w:tcW w:w="3950" w:type="dxa"/>
+                  <w:shd w:val="clear" w:color="auto" w:fill="E7EEE9"/>
+                </w:tcPr>
+                <w:p>
+                  <w:pPr>
+                    <w:spacing w:before="20" w:after="20" w:line="260" w:lineRule="auto"/>
+                    <w:jc w:val="start"/>
+                    <w:rPr>
+                      <w:sz w:val="18"/>
+                    </w:rPr>
+                  </w:pPr>
+                  <w:r>
+                    <w:rPr>
+                      <w:rFonts w:ascii="宋体" w:hAnsi="宋体" w:eastAsia="宋体" w:cs="宋体"/>
+                      <w:b/>
+                      <w:bCs/>
+                      <w:sz w:val="18"/>
+                      <w:szCs w:val="18"/>
+                    </w:rPr>
+                    <w:t xml:space="preserve">环节（evidence/exp02/wordbook-http.txt）</w:t>
+                  </w:r>
+                </w:p>
+              </w:tc>
+              <w:tc>
+                <w:tcPr>
+                  <w:tcW w:w="3950" w:type="dxa"/>
+                  <w:shd w:val="clear" w:color="auto" w:fill="E7EEE9"/>
+                </w:tcPr>
+                <w:p>
+                  <w:pPr>
+                    <w:spacing w:before="20" w:after="20" w:line="260" w:lineRule="auto"/>
+                    <w:jc w:val="start"/>
+                    <w:rPr>
+                      <w:sz w:val="18"/>
+                    </w:rPr>
+                  </w:pPr>
+                  <w:r>
+                    <w:rPr>
+                      <w:rFonts w:ascii="宋体" w:hAnsi="宋体" w:eastAsia="宋体" w:cs="宋体"/>
+                      <w:b/>
+                      <w:bCs/>
+                      <w:sz w:val="18"/>
+                      <w:szCs w:val="18"/>
+                    </w:rPr>
+                    <w:t xml:space="preserve">实测结果</w:t>
+                  </w:r>
+                </w:p>
+              </w:tc>
+            </w:tr>
+            <w:tr>
+              <w:tc>
+                <w:tcPr>
+                  <w:tcW w:w="3950" w:type="dxa"/>
+                </w:tcPr>
+                <w:p>
+                  <w:pPr>
+                    <w:spacing w:before="20" w:after="20" w:line="260" w:lineRule="auto"/>
+                    <w:jc w:val="start"/>
+                    <w:rPr>
+                      <w:sz w:val="18"/>
+                    </w:rPr>
+                  </w:pPr>
+                  <w:r>
+                    <w:rPr>
+                      <w:rFonts w:ascii="宋体" w:hAnsi="宋体" w:eastAsia="宋体" w:cs="宋体"/>
+                      <w:b w:val="0"/>
+                      <w:bCs w:val="0"/>
+                      <w:sz w:val="18"/>
+                      <w:szCs w:val="18"/>
+                    </w:rPr>
+                    <w:t xml:space="preserve">新账户只选考研词表</w:t>
+                  </w:r>
+                </w:p>
+              </w:tc>
+              <w:tc>
+                <w:tcPr>
+                  <w:tcW w:w="3950" w:type="dxa"/>
+                </w:tcPr>
+                <w:p>
+                  <w:pPr>
+                    <w:spacing w:before="20" w:after="20" w:line="260" w:lineRule="auto"/>
+                    <w:jc w:val="start"/>
+                    <w:rPr>
+                      <w:sz w:val="18"/>
+                    </w:rPr>
+                  </w:pPr>
+                  <w:r>
+                    <w:rPr>
+                      <w:rFonts w:ascii="宋体" w:hAnsi="宋体" w:eastAsia="宋体" w:cs="宋体"/>
+                      <w:b w:val="0"/>
+                      <w:bCs w:val="0"/>
+                      <w:sz w:val="18"/>
+                      <w:szCs w:val="18"/>
+                    </w:rPr>
+                    <w:t xml:space="preserve">考研词表（ECDICT）4778 个词条</w:t>
+                  </w:r>
+                </w:p>
+              </w:tc>
+            </w:tr>
+            <w:tr>
+              <w:tc>
+                <w:tcPr>
+                  <w:tcW w:w="3950" w:type="dxa"/>
+                </w:tcPr>
+                <w:p>
+                  <w:pPr>
+                    <w:spacing w:before="20" w:after="20" w:line="260" w:lineRule="auto"/>
+                    <w:jc w:val="start"/>
+                    <w:rPr>
+                      <w:sz w:val="18"/>
+                    </w:rPr>
+                  </w:pPr>
+                  <w:r>
+                    <w:rPr>
+                      <w:rFonts w:ascii="宋体" w:hAnsi="宋体" w:eastAsia="宋体" w:cs="宋体"/>
+                      <w:b w:val="0"/>
+                      <w:bCs w:val="0"/>
+                      <w:sz w:val="18"/>
+                      <w:szCs w:val="18"/>
+                    </w:rPr>
+                    <w:t xml:space="preserve">辨义 10 题，一题故意答错</w:t>
+                  </w:r>
+                </w:p>
+              </w:tc>
+              <w:tc>
+                <w:tcPr>
+                  <w:tcW w:w="3950" w:type="dxa"/>
+                </w:tcPr>
+                <w:p>
+                  <w:pPr>
+                    <w:spacing w:before="20" w:after="20" w:line="260" w:lineRule="auto"/>
+                    <w:jc w:val="start"/>
+                    <w:rPr>
+                      <w:sz w:val="18"/>
+                    </w:rPr>
+                  </w:pPr>
+                  <w:r>
+                    <w:rPr>
+                      <w:rFonts w:ascii="宋体" w:hAnsi="宋体" w:eastAsia="宋体" w:cs="宋体"/>
+                      <w:b w:val="0"/>
+                      <w:bCs w:val="0"/>
+                      <w:sz w:val="18"/>
+                      <w:szCs w:val="18"/>
+                    </w:rPr>
+                    <w:t xml:space="preserve">predecessor 答错，反馈列出词对：同族 precede</w:t>
+                  </w:r>
+                </w:p>
+              </w:tc>
+            </w:tr>
+            <w:tr>
+              <w:tc>
+                <w:tcPr>
+                  <w:tcW w:w="3950" w:type="dxa"/>
+                </w:tcPr>
+                <w:p>
+                  <w:pPr>
+                    <w:spacing w:before="20" w:after="20" w:line="260" w:lineRule="auto"/>
+                    <w:jc w:val="start"/>
+                    <w:rPr>
+                      <w:sz w:val="18"/>
+                    </w:rPr>
+                  </w:pPr>
+                  <w:r>
+                    <w:rPr>
+                      <w:rFonts w:ascii="宋体" w:hAnsi="宋体" w:eastAsia="宋体" w:cs="宋体"/>
+                      <w:b w:val="0"/>
+                      <w:bCs w:val="0"/>
+                      <w:sz w:val="18"/>
+                      <w:szCs w:val="18"/>
+                    </w:rPr>
+                    <w:t xml:space="preserve">诊断页成对复习</w:t>
+                  </w:r>
+                </w:p>
+              </w:tc>
+              <w:tc>
+                <w:tcPr>
+                  <w:tcW w:w="3950" w:type="dxa"/>
+                </w:tcPr>
+                <w:p>
+                  <w:pPr>
+                    <w:spacing w:before="20" w:after="20" w:line="260" w:lineRule="auto"/>
+                    <w:jc w:val="start"/>
+                    <w:rPr>
+                      <w:sz w:val="18"/>
+                    </w:rPr>
+                  </w:pPr>
+                  <w:r>
+                    <w:rPr>
+                      <w:rFonts w:ascii="宋体" w:hAnsi="宋体" w:eastAsia="宋体" w:cs="宋体"/>
+                      <w:b w:val="0"/>
+                      <w:bCs w:val="0"/>
+                      <w:sz w:val="18"/>
+                      <w:szCs w:val="18"/>
+                    </w:rPr>
+                    <w:t xml:space="preserve">当前弱项 predecessor，词对：同族 precede（未练）</w:t>
+                  </w:r>
+                </w:p>
+              </w:tc>
+            </w:tr>
+            <w:tr>
+              <w:tc>
+                <w:tcPr>
+                  <w:tcW w:w="3950" w:type="dxa"/>
+                </w:tcPr>
+                <w:p>
+                  <w:pPr>
+                    <w:spacing w:before="20" w:after="20" w:line="260" w:lineRule="auto"/>
+                    <w:jc w:val="start"/>
+                    <w:rPr>
+                      <w:sz w:val="18"/>
+                    </w:rPr>
+                  </w:pPr>
+                  <w:r>
+                    <w:rPr>
+                      <w:rFonts w:ascii="宋体" w:hAnsi="宋体" w:eastAsia="宋体" w:cs="宋体"/>
+                      <w:b w:val="0"/>
+                      <w:bCs w:val="0"/>
+                      <w:sz w:val="18"/>
+                      <w:szCs w:val="18"/>
+                    </w:rPr>
+                    <w:t xml:space="preserve">发起成对练习</w:t>
+                  </w:r>
+                </w:p>
+              </w:tc>
+              <w:tc>
+                <w:tcPr>
+                  <w:tcW w:w="3950" w:type="dxa"/>
+                </w:tcPr>
+                <w:p>
+                  <w:pPr>
+                    <w:spacing w:before="20" w:after="20" w:line="260" w:lineRule="auto"/>
+                    <w:jc w:val="start"/>
+                    <w:rPr>
+                      <w:sz w:val="18"/>
+                    </w:rPr>
+                  </w:pPr>
+                  <w:r>
+                    <w:rPr>
+                      <w:rFonts w:ascii="宋体" w:hAnsi="宋体" w:eastAsia="宋体" w:cs="宋体"/>
+                      <w:b w:val="0"/>
+                      <w:bCs w:val="0"/>
+                      <w:sz w:val="18"/>
+                      <w:szCs w:val="18"/>
+                    </w:rPr>
+                    <w:t xml:space="preserve">2 题，选题理由均为定向练习（targeted）</w:t>
+                  </w:r>
+                </w:p>
+              </w:tc>
+            </w:tr>
+          </w:tbl>
+          <w:p>
+            <w:pPr>
+              <w:pStyle w:val="Normal"/>
+              <w:widowControl/>
+              <w:spacing w:before="0" w:after="0" w:lineRule="auto" w:line="240"/>
+              <w:jc w:val="start"/>
+              <w:rPr>
+                <w:b w:val="0"/>
+                <w:sz w:val="12"/>
+                <w:szCs w:val="12"/>
+              </w:rPr>
+            </w:pPr>
+          </w:p>
+          <w:p>
+            <w:pPr>
+              <w:pStyle w:val="Normal"/>
+              <w:widowControl/>
+              <w:keepNext/>
+              <w:spacing w:before="0" w:after="0" w:lineRule="auto" w:line="240"/>
+              <w:jc w:val="center"/>
+              <w:rPr>
+                <w:b w:val="0"/>
+                <w:sz w:val="24"/>
+                <w:szCs w:val="24"/>
+              </w:rPr>
+            </w:pPr>
+            <w:r>
+              <w:drawing>
+                <wp:inline distT="0" distB="0" distL="0" distR="0">
+                  <wp:extent cx="5016500" cy="3527226"/>
+                  <wp:docPr id="5009" name="e2_paired_feedback.png"/>
+                  <wp:cNvGraphicFramePr>
+                    <a:graphicFrameLocks xmlns:a="http://schemas.openxmlformats.org/drawingml/2006/main" noChangeAspect="1"/>
+                  </wp:cNvGraphicFramePr>
+                  <a:graphic xmlns:a="http://schemas.openxmlformats.org/drawingml/2006/main">
+                    <a:graphicData uri="http://schemas.openxmlformats.org/drawingml/2006/picture">
+                      <pic:pic xmlns:pic="http://schemas.openxmlformats.org/drawingml/2006/picture">
+                        <pic:nvPicPr>
+                          <pic:cNvPr id="5009" name="e2_paired_feedback.png"/>
+                          <pic:cNvPicPr/>
+                        </pic:nvPicPr>
+                        <pic:blipFill>
+                          <a:blip r:embed="rId15"/>
+                          <a:stretch>
+                            <a:fillRect/>
+                          </a:stretch>
+                        </pic:blipFill>
+                        <pic:spPr>
+                          <a:xfrm>
+                            <a:off x="0" y="0"/>
+                            <a:ext cx="5016500" cy="3527226"/>
+                          </a:xfrm>
+                          <a:prstGeom prst="rect">
+                            <a:avLst/>
+                          </a:prstGeom>
+                          <a:ln w="6350">
+                            <a:solidFill>
+                              <a:srgbClr val="BBBBBB"/>
+                            </a:solidFill>
+                          </a:ln>
+                        </pic:spPr>
+                      </pic:pic>
+                    </a:graphicData>
+                  </a:graphic>
+                </wp:inline>
+              </w:drawing>
+            </w:r>
+          </w:p>
+          <w:p>
+            <w:pPr>
+              <w:pStyle w:val="Normal"/>
+              <w:widowControl/>
+              <w:spacing w:before="0" w:after="120" w:lineRule="auto" w:line="300"/>
+              <w:jc w:val="center"/>
+              <w:rPr>
+                <w:b w:val="0"/>
+                <w:sz w:val="21"/>
+                <w:szCs w:val="21"/>
+              </w:rPr>
+            </w:pPr>
+            <w:r>
+              <w:rPr>
+                <w:rFonts w:ascii="宋体" w:hAnsi="宋体" w:eastAsia="宋体" w:cs="宋体"/>
+                <w:b w:val="0"/>
+                <w:bCs w:val="0"/>
+                <w:sz w:val="21"/>
+                <w:szCs w:val="21"/>
+              </w:rPr>
+              <w:t xml:space="preserve">图 9  拼写题把 adapt 写成形近词 adopt：反馈列出形近、近义词及释义</w:t>
+            </w:r>
+          </w:p>
+          <w:p>
+            <w:pPr>
+              <w:pStyle w:val="Normal"/>
+              <w:widowControl/>
+              <w:keepNext/>
+              <w:spacing w:before="0" w:after="0" w:lineRule="auto" w:line="240"/>
+              <w:jc w:val="center"/>
+              <w:rPr>
+                <w:b w:val="0"/>
+                <w:sz w:val="24"/>
+                <w:szCs w:val="24"/>
+              </w:rPr>
+            </w:pPr>
+            <w:r>
+              <w:drawing>
+                <wp:inline distT="0" distB="0" distL="0" distR="0">
+                  <wp:extent cx="5016500" cy="1029702"/>
+                  <wp:docPr id="5010" name="e2_paired_insights.png"/>
+                  <wp:cNvGraphicFramePr>
+                    <a:graphicFrameLocks xmlns:a="http://schemas.openxmlformats.org/drawingml/2006/main" noChangeAspect="1"/>
+                  </wp:cNvGraphicFramePr>
+                  <a:graphic xmlns:a="http://schemas.openxmlformats.org/drawingml/2006/main">
+                    <a:graphicData uri="http://schemas.openxmlformats.org/drawingml/2006/picture">
+                      <pic:pic xmlns:pic="http://schemas.openxmlformats.org/drawingml/2006/picture">
+                        <pic:nvPicPr>
+                          <pic:cNvPr id="5010" name="e2_paired_insights.png"/>
+                          <pic:cNvPicPr/>
+                        </pic:nvPicPr>
+                        <pic:blipFill>
+                          <a:blip r:embed="rId16"/>
+                          <a:stretch>
+                            <a:fillRect/>
+                          </a:stretch>
+                        </pic:blipFill>
+                        <pic:spPr>
+                          <a:xfrm>
+                            <a:off x="0" y="0"/>
+                            <a:ext cx="5016500" cy="1029702"/>
+                          </a:xfrm>
+                          <a:prstGeom prst="rect">
+                            <a:avLst/>
+                          </a:prstGeom>
+                          <a:ln w="6350">
+                            <a:solidFill>
+                              <a:srgbClr val="BBBBBB"/>
+                            </a:solidFill>
+                          </a:ln>
+                        </pic:spPr>
+                      </pic:pic>
+                    </a:graphicData>
+                  </a:graphic>
+                </wp:inline>
+              </w:drawing>
+            </w:r>
+          </w:p>
+          <w:p>
+            <w:pPr>
+              <w:pStyle w:val="Normal"/>
+              <w:widowControl/>
+              <w:spacing w:before="0" w:after="120" w:lineRule="auto" w:line="300"/>
+              <w:jc w:val="center"/>
+              <w:rPr>
+                <w:b w:val="0"/>
+                <w:sz w:val="21"/>
+                <w:szCs w:val="21"/>
+              </w:rPr>
+            </w:pPr>
+            <w:r>
+              <w:rPr>
+                <w:rFonts w:ascii="宋体" w:hAnsi="宋体" w:eastAsia="宋体" w:cs="宋体"/>
+                <w:b w:val="0"/>
+                <w:bCs w:val="0"/>
+                <w:sz w:val="21"/>
+                <w:szCs w:val="21"/>
+              </w:rPr>
+              <w:t xml:space="preserve">图 10  诊断页“成对复习”：弱项 adapt 与目标词表内的词对，可发起成对练习</w:t>
+            </w:r>
+          </w:p>
+          <w:p>
+            <w:pPr>
+              <w:pStyle w:val="Normal"/>
+              <w:widowControl/>
+              <w:spacing w:before="0" w:after="0" w:lineRule="auto" w:line="360"/>
+              <w:ind w:firstLine="480"/>
+              <w:jc w:val="start"/>
+              <w:rPr>
+                <w:b w:val="0"/>
+                <w:sz w:val="24"/>
+                <w:szCs w:val="24"/>
+              </w:rPr>
+            </w:pPr>
+            <w:r>
+              <w:rPr>
+                <w:rFonts w:ascii="宋体" w:hAnsi="宋体" w:eastAsia="宋体" w:cs="宋体"/>
+                <w:b w:val="0"/>
+                <w:bCs w:val="0"/>
+                <w:sz w:val="24"/>
+                <w:szCs w:val="24"/>
+              </w:rPr>
+              <w:t xml:space="preserve">词对与题目都由规则生成，没有逐条人工复核；WordNet 的近义含部分较宽的义项，因此页面称“词对”而不称“易混词”。词对只决定展示和用户主动发起的练习，不改变默认组卷、复习规则与学习状态。</w:t>
+            </w:r>
+          </w:p>
+          <w:p>
+            <w:pPr>
+              <w:pStyle w:val="Normal"/>
+              <w:widowControl/>
+              <w:keepNext/>
+              <w:spacing w:before="0" w:after="0" w:lineRule="auto" w:line="360"/>
+              <w:jc w:val="start"/>
+              <w:rPr>
+                <w:b w:val="0"/>
+                <w:sz w:val="24"/>
+                <w:szCs w:val="24"/>
+              </w:rPr>
+            </w:pPr>
+            <w:r>
+              <w:rPr>
+                <w:rFonts w:ascii="宋体" w:hAnsi="宋体" w:eastAsia="宋体" w:cs="宋体"/>
+                <w:b/>
+                <w:bCs/>
+                <w:sz w:val="24"/>
+                <w:szCs w:val="24"/>
+              </w:rPr>
+              <w:t xml:space="preserve">6. 探讨分析</w:t>
             </w:r>
           </w:p>
           <w:p>

</xml_diff>